<commit_message>
update rs + pr
</commit_message>
<xml_diff>
--- a/resume/word/CV_VoHongQuan.docx
+++ b/resume/word/CV_VoHongQuan.docx
@@ -38,14 +38,16 @@
         </w:rPr>
         <w:t xml:space="preserve"> | </w:t>
       </w:r>
-      <w:r>
-        <w:rPr>
-          <w:rFonts w:ascii="Times New Roman" w:hAnsi="Times New Roman" w:cs="Times New Roman"/>
-          <w:sz w:val="21"/>
-          <w:szCs w:val="21"/>
-        </w:rPr>
-        <w:t xml:space="preserve">(+84) 363 645 485</w:t>
-      </w:r>
+      <w:hyperlink r:id="rIdPhone" w:history="1">
+        <w:r>
+          <w:rPr>
+            <w:rFonts w:ascii="Times New Roman" w:hAnsi="Times New Roman" w:cs="Times New Roman"/>
+            <w:sz w:val="21"/>
+            <w:szCs w:val="21"/>
+          </w:rPr>
+          <w:t xml:space="preserve">(+84) 363 645 485</w:t>
+        </w:r>
+      </w:hyperlink>
       <w:r>
         <w:rPr>
           <w:rFonts w:ascii="Times New Roman" w:hAnsi="Times New Roman" w:cs="Times New Roman"/>
@@ -95,7 +97,7 @@
             <w:sz w:val="21"/>
             <w:szCs w:val="21"/>
           </w:rPr>
-          <w:t xml:space="preserve">linkedin.com/in/vhq-hcmute</w:t>
+          <w:t xml:space="preserve">vohongquann.github.io/Portfolio</w:t>
         </w:r>
       </w:hyperlink>
     </w:p>
@@ -314,7 +316,7 @@
           <w:sz w:val="21"/>
           <w:szCs w:val="21"/>
         </w:rPr>
-        <w:t xml:space="preserve">Support reinforcement learning training and real-time testing of robot control systems.</w:t>
+        <w:t xml:space="preserve">Train and evaluate reinforcement learning controllers for real-time robotic systems.</w:t>
       </w:r>
     </w:p>
     <w:p>
@@ -334,7 +336,7 @@
           <w:sz w:val="21"/>
           <w:szCs w:val="21"/>
         </w:rPr>
-        <w:t xml:space="preserve">Assist in designing reward functions and tuning hyperparameters for reinforcement learning agents.</w:t>
+        <w:t xml:space="preserve">Design reward functions and tune hyperparameters for stable policies.</w:t>
       </w:r>
     </w:p>
     <w:p>
@@ -440,7 +442,7 @@
           <w:sz w:val="21"/>
           <w:szCs w:val="21"/>
         </w:rPr>
-        <w:t xml:space="preserve">Built a four-layer cascaded flight controller (position 50 Hz, velocity 100 Hz, attitude 250 Hz, rate 500 Hz) for a Crazyflie 2.1 Brushless in Isaac Lab 3.0, with physical constants traced to the datasheet, system-identification papers and Bitcraze firmware.</w:t>
+        <w:t xml:space="preserve">Built a four-layer flight controller (50–500 Hz) and physics-based Crazyflie model in Isaac Lab 3.0.</w:t>
       </w:r>
     </w:p>
     <w:p>
@@ -460,7 +462,7 @@
           <w:sz w:val="21"/>
           <w:szCs w:val="21"/>
         </w:rPr>
-        <w:t xml:space="preserve">Trained one small MLP per layer with PPO, bottom-up and then frozen, to output the 9 PID gains of its layer at every step; cut tracking error by 23–62% against the hand-tuned PID on all four layers (attitude 15.5° to 5.9°).</w:t>
+        <w:t xml:space="preserve">Trained one PPO MLP per layer to tune 9 PID gains, reducing tracking error 23–62% versus PID (attitude: 15.5° to 5.9°).</w:t>
       </w:r>
     </w:p>
     <w:p>
@@ -480,7 +482,7 @@
           <w:sz w:val="21"/>
           <w:szCs w:val="21"/>
         </w:rPr>
-        <w:t xml:space="preserve">Designed the gain network so that zero output equals the tuned PID, so training starts from a stable controller and converges in a few hundred PPO iterations; kept the networks small enough for the drone's STM32 microcontroller.</w:t>
+        <w:t xml:space="preserve">Anchored zero network output to the stable PID baseline and sized each MLP for STM32 deployment.</w:t>
       </w:r>
     </w:p>
     <w:p>
@@ -568,7 +570,7 @@
           <w:sz w:val="21"/>
           <w:szCs w:val="21"/>
         </w:rPr>
-        <w:t xml:space="preserve">Trained a velocity policy with PPO that turns a forward-speed and turn-rate command into wheel torques for a Pololu Balboa 32U4, working only from a raw IMU (complementary filter) and the wheel encoders, as the real robot would.</w:t>
+        <w:t xml:space="preserve">Trained a PPO velocity policy that maps commands and raw IMU/encoder data to wheel torques.</w:t>
       </w:r>
     </w:p>
     <w:p>
@@ -588,7 +590,7 @@
           <w:sz w:val="21"/>
           <w:szCs w:val="21"/>
         </w:rPr>
-        <w:t xml:space="preserve">Froze it and trained a position policy on top that drives to a goal pose; on 768 randomized episodes (pushes, IMU noise, randomized mass, friction and centre of mass) neither fell, with median errors of 8 mm (position) and 0.021 m/s (velocity).</w:t>
+        <w:t xml:space="preserve">Added a frozen position policy; recorded zero falls in 768 randomized episodes and 8 mm median goal error.</w:t>
       </w:r>
     </w:p>
     <w:p>
@@ -608,7 +610,7 @@
           <w:sz w:val="21"/>
           <w:szCs w:val="21"/>
         </w:rPr>
-        <w:t xml:space="preserve">Benchmarked against LQR and PID on the same tests: speed-step error 0.026 m/s settled in 0.36 s, versus 0.067 m/s and 1.1 s for LQR; goals reached within 2–6 mm, versus 13–50 mm for LQR.</w:t>
+        <w:t xml:space="preserve">Beat LQR on speed steps: 0.026 m/s error in 0.36 s versus 0.067 m/s in 1.1 s.</w:t>
       </w:r>
     </w:p>
     <w:p>
@@ -696,7 +698,7 @@
           <w:sz w:val="21"/>
           <w:szCs w:val="21"/>
         </w:rPr>
-        <w:t xml:space="preserve">Modeled the QUBE-Servo 2 in Isaac Lab: URDF generated from CAD, a DC-motor model (PWM, current, back-EMF, torque) and quantized encoders with filtered velocity, simulated at 500 Hz.</w:t>
+        <w:t xml:space="preserve">Modeled the QUBE-Servo 2 from CAD with a DC motor and quantized encoders at 500 Hz.</w:t>
       </w:r>
     </w:p>
     <w:p>
@@ -716,7 +718,7 @@
           <w:sz w:val="21"/>
           <w:szCs w:val="21"/>
         </w:rPr>
-        <w:t xml:space="preserve">Trained a PPO policy (4,096 parallel robots, 1,500 iterations, 64 minutes on one RTX 3060) that outputs the six gains of a two-loop cascade PID at 100 Hz from 12 observations.</w:t>
+        <w:t xml:space="preserve">Trained a PPO policy on 4,096 robots in 64 minutes to tune six cascade-PID gains at 100 Hz.</w:t>
       </w:r>
     </w:p>
     <w:p>
@@ -736,7 +738,7 @@
           <w:sz w:val="21"/>
           <w:szCs w:val="21"/>
         </w:rPr>
-        <w:t xml:space="preserve">Validated on 256 simulated robots, each with its own motor constants: swing-up in 0.40 s (median), arm steps settled in 0.23–0.50 s with at most 1.4° median overshoot (3 of 256 episodes ended early).</w:t>
+        <w:t xml:space="preserve">Validated on 256 randomized robots: 0.40 s swing-up, 0.23–0.50 s settling and at most 1.4° median overshoot.</w:t>
       </w:r>
     </w:p>
     <w:p>

</xml_diff>